<commit_message>
docs: focus phrase-report on Vietnamese progress report Word document and remove English artifacts
</commit_message>
<xml_diff>
--- a/phrase-report/Phrase-1/Bao_Cao_Tien_Do_Dot_1_VN.docx
+++ b/phrase-report/Phrase-1/Bao_Cao_Tien_Do_Dot_1_VN.docx
@@ -242,7 +242,7 @@
                 <w:color w:val="000000"/>
                 <w:sz w:val="20"/>
               </w:rPr>
-              <w:t>Kính gửi Thầy/Cô Hướng dẫn: Báo cáo đợt 1 này tổng hợp toàn bộ kết quả thực nghiệm mô hình và kiến trúc hệ thống MedVision AI tính đến thời điểm hiện tại. Phần mô hình Deep Learning và kiểm thuật khoa học đã hoàn thành 100%: Chúng em đã tiền xử lý 6.900 ảnh X-quang sạch, thực hiện chia tập ở mức bệnh nhân (patient-level zero-leakage split) và kiểm thử độc lập trên bộ ảnh ngoạt viện Montgomery (OOD test set). Các mô hình ResNet-18, DenseNet-121, EfficientNet-B0 đạt AUC nội bộ &gt; 0.95 và AUC ngoại viện 0.83 (vượt trội so với baseline HOG+SVM 0.60). Phần giao diện ứng dụng Web CDSS đã xây dựng khung 4-Tab chính và hiện đang trong giai đoạn hoàn thiện giao diện demo lâm sàng hoàn chỉnh.</w:t>
+              <w:t>Kính gửi Thầy/Cô Hướng dẫn: Báo cáo đợt 1 này tổng hợp toàn bộ kết quả thực nghiệm mô hình và kiến trúc hệ thống MedVision AI tính đến thời điểm hiện tại. Phần mô hình Deep Learning và kiểm thuật khoa học đã hoàn thành 100%: Chúng em đã tiền xử lý 6.900 ảnh X-quang sạch, thực hiện chia tập ở mức bệnh nhân (patient-level zero-leakage split) và kiểm thử độc lập trên bộ ảnh ngoại viện Montgomery (OOD test set). Các mô hình ResNet-18, DenseNet-121, EfficientNet-B0 đạt AUC nội bộ &gt; 0.95 và AUC ngoại viện 0.83 (vượt trội so với baseline HOG+SVM 0.60). Phần giao diện ứng dụng Web CDSS đã xây dựng khung 4-Tab chính và hiện đang trong giai đoạn hoàn thiện giao diện demo lâm sàng hoàn chỉnh.</w:t>
             </w:r>
           </w:p>
         </w:tc>
@@ -2882,7 +2882,7 @@
           <w:i w:val="0"/>
           <w:sz w:val="22"/>
         </w:rPr>
-        <w:t>Để loại bỏ hiện tượng 'hộp đen' (black-box model), hệ thống tích hợp mô-đun Grad-CAM trích xuất bản đồ nhiệt chú ý không gian trên lớp Convolutional cuối (`denseblock4`). Hình 4.1 minh họa kết quả khoanh vùng tổn thương thực tế trên ảnh X-quang phổi của bệnh nhân:</w:t>
+        <w:t>Để loại bỏ hiện tượng 'hộp đen' (black-box model), hệ thống tích hợp mô-đun Grad-CAM trích xuất bản đồ nhiệt chú ý không gian trên lớp Convolutional cuối (`denseblock4`). Hình 4.1 minh họa kết quả khoanh vùng tổn thương thực tế trên ảnh X-quang phổi của bệnh nhân sau khi mô hình nạp đúng trọng số huấn luyện:</w:t>
       </w:r>
     </w:p>
     <w:p>

</xml_diff>